<commit_message>
docs(examples): demonstrate checkbox, decorative, fldLock readback
Update the three docx examples to exercise the newly-supported features:

- content-controls: the Approval field is now a real checkbox content control
  (type=checkbox, checked=true) instead of a create-in-Word note.
- pictures: adds a decorative=true image; decorative moves from the
  "unsupported" list to a demonstrated feature.
- fields: the locked-PAGE section notes that get/query now report fldLock=true
  (locked-only).

All three regenerated and validate clean; verified rendering in real Office.
</commit_message>
<xml_diff>
--- a/examples/word/content-controls.docx
+++ b/examples/word/content-controls.docx
@@ -206,6 +206,34 @@
         <w:p>
           <w:r>
             <w:t xml:space="preserve">Approved by HR — signature on file.</w:t>
+          </w:r>
+        </w:p>
+      </w:sdtContent>
+    </w:sdt>
+    <w:p>
+      <w:pPr>
+        <w:pStyle w:val="Heading2"/>
+      </w:pPr>
+      <w:r>
+        <w:rPr/>
+        <w:t xml:space="preserve">HR approved</w:t>
+      </w:r>
+    </w:p>
+    <w:sdt>
+      <w:sdtPr>
+        <w:id w:val="8"/>
+        <w:alias w:val="Approved"/>
+        <w:tag w:val="hrApproved"/>
+        <w14:checkbox>
+          <w14:checked w14:val="1"/>
+          <w14:checkedState w14:font="MS Gothic" w14:val="2612"/>
+          <w14:uncheckedState w14:font="MS Gothic" w14:val="2610"/>
+        </w14:checkbox>
+      </w:sdtPr>
+      <w:sdtContent>
+        <w:p>
+          <w:r>
+            <w:t xml:space="preserve">☒</w:t>
           </w:r>
         </w:p>
       </w:sdtContent>

</xml_diff>